<commit_message>
feat(pages): PDI completo, 10 trilhas e 40 atividades no portal
Retrofit 01-05 com decisoes, impacto, referencias e roteiro de dominio.
Trilhas 06-10 e 03-a1 criadas no padrao SPEC (HTML/DOCX/PDF).
Portal atualizado: 40 atividades, 645 arquivos, zero links quebrados.
Normalizacao PT-BR sem travessao em todo o PDI.
</commit_message>
<xml_diff>
--- a/_inbox/PDI/01-orquestracao-corporativa-n8n/atividade-1-padrao-erros-sdr/7-apresentacao/pdi-orquestracao-corporativa-n8n-a1.docx
+++ b/_inbox/PDI/01-orquestracao-corporativa-n8n/atividade-1-padrao-erros-sdr/7-apresentacao/pdi-orquestracao-corporativa-n8n-a1.docx
@@ -59,7 +59,7 @@
           <w:color w:val="495560"/>
           <w:sz w:val="22"/>
         </w:rPr>
-        <w:t>Unidade: FV Marketing / V4 Company — Automação &amp; Infraestrutura</w:t>
+        <w:t>Unidade: FV Marketing / V4 Company: Automação &amp; Infraestrutura</w:t>
         <w:br/>
       </w:r>
       <w:r>
@@ -115,7 +115,7 @@
     </w:p>
     <w:p>
       <w:r>
-        <w:t>Este relatório documenta o PDI (Padrão Universal de Tratamento de Erros) implementado para resolver esse problema de raiz — não apenas corrigindo as falhas pontuais, mas estabelecendo um padrão enterprise reutilizável para todos os workflows da operação.</w:t>
+        <w:t>Este relatório documenta o PDI (Padrão Universal de Tratamento de Erros) implementado para resolver esse problema de raiz: não apenas corrigindo as falhas pontuais, mas estabelecendo um padrão enterprise reutilizável para todos os workflows da operação.</w:t>
       </w:r>
     </w:p>
     <w:p>
@@ -201,7 +201,7 @@
           </w:tcPr>
           <w:p>
             <w:r>
-              <w:t>JS timeout 25min — event loop bloqueado por SplitInBatches ausente</w:t>
+              <w:t>JS timeout 25min: event loop bloqueado por SplitInBatches ausente</w:t>
             </w:r>
           </w:p>
         </w:tc>
@@ -233,7 +233,7 @@
           </w:tcPr>
           <w:p>
             <w:r>
-              <w:t>Task runner desconectado — servidor precisou de tuning</w:t>
+              <w:t>Task runner desconectado: servidor precisou de tuning</w:t>
             </w:r>
           </w:p>
         </w:tc>
@@ -265,7 +265,7 @@
           </w:tcPr>
           <w:p>
             <w:r>
-              <w:t>Redis Cloud inacessível — DNS externo sem fallback</w:t>
+              <w:t>Redis Cloud inacessível: DNS externo sem fallback</w:t>
             </w:r>
           </w:p>
         </w:tc>
@@ -297,7 +297,7 @@
           </w:tcPr>
           <w:p>
             <w:r>
-              <w:t>Rate limit Chatwoot — sem wait entre requisições</w:t>
+              <w:t>Rate limit Chatwoot: sem wait entre requisições</w:t>
             </w:r>
           </w:p>
         </w:tc>
@@ -329,7 +329,7 @@
           </w:tcPr>
           <w:p>
             <w:r>
-              <w:t>toDateTime undefined — campo opcional sem validação</w:t>
+              <w:t>toDateTime undefined: campo opcional sem validação</w:t>
             </w:r>
           </w:p>
         </w:tc>
@@ -361,7 +361,7 @@
           </w:tcPr>
           <w:p>
             <w:r>
-              <w:t>Null constraint em telefone — insert no Supabase sem validação</w:t>
+              <w:t>Null constraint em telefone: insert no Supabase sem validação</w:t>
             </w:r>
           </w:p>
         </w:tc>
@@ -393,7 +393,7 @@
           </w:tcPr>
           <w:p>
             <w:r>
-              <w:t>404 no Ekyte — board ID mudou sem atualizar o workflow</w:t>
+              <w:t>404 no Ekyte: board ID mudou sem atualizar o workflow</w:t>
             </w:r>
           </w:p>
         </w:tc>
@@ -422,7 +422,7 @@
     </w:p>
     <w:p>
       <w:r>
-        <w:t>Ausência de padronização: cada workflow tratava erro do seu jeito improvisado — ou simplesmente não tratava. Não havia taxonomia de erros, política de retry, notificação, persistência ou proteção contra cascata. O resultado era um ecossistema frágil onde uma falha em um nó poderia derrubar todo o fluxo sem deixar rastro.</w:t>
+        <w:t>Ausência de padronização: cada workflow tratava erro do seu jeito improvisado: ou simplesmente não tratava. Não havia taxonomia de erros, política de retry, notificação, persistência ou proteção contra cascata. O resultado era um ecossistema frágil onde uma falha em um nó poderia derrubar todo o fluxo sem deixar rastro.</w:t>
       </w:r>
     </w:p>
     <w:p>
@@ -438,7 +438,7 @@
     </w:p>
     <w:p>
       <w:r>
-        <w:t>Três camadas obrigatórias e complementares. Não são alternativas — um workflow enterprise precisa das três.</w:t>
+        <w:t>Três camadas obrigatórias e complementares. Não são alternativas: um workflow enterprise precisa das três.</w:t>
       </w:r>
     </w:p>
     <w:p>
@@ -454,7 +454,7 @@
     </w:p>
     <w:p>
       <w:r>
-        <w:t>retryOnFail + continueErrorOutput em cada nó falível. Captura ~73% das falhas transientes (429, 503, timeout) no próprio nó — sem overhead de workflow externo.</w:t>
+        <w:t>retryOnFail + continueErrorOutput em cada nó falível. Captura ~73% das falhas transientes (429, 503, timeout) no próprio nó: sem overhead de workflow externo.</w:t>
       </w:r>
     </w:p>
     <w:p>
@@ -1021,7 +1021,7 @@
         <w:br/>
         <w:t xml:space="preserve">  "workflowId": "abc123",</w:t>
         <w:br/>
-        <w:t xml:space="preserve">  "failedNode": "HTTP Request — Attio",</w:t>
+        <w:t xml:space="preserve">  "failedNode": "HTTP Request: Attio",</w:t>
         <w:br/>
         <w:t xml:space="preserve">  "errorMessage": "Request failed with status code 502",</w:t>
         <w:br/>
@@ -1556,7 +1556,7 @@
           </w:tcPr>
           <w:p>
             <w:r>
-              <w:t>—</w:t>
+              <w:t>n/a</w:t>
             </w:r>
           </w:p>
         </w:tc>
@@ -1566,7 +1566,7 @@
           </w:tcPr>
           <w:p>
             <w:r>
-              <w:t>—</w:t>
+              <w:t>n/a</w:t>
             </w:r>
           </w:p>
         </w:tc>
@@ -1576,7 +1576,7 @@
           </w:tcPr>
           <w:p>
             <w:r>
-              <w:t>NUNCA retentar — erro de lógica</w:t>
+              <w:t>NUNCA retentar: erro de lógica</w:t>
             </w:r>
           </w:p>
         </w:tc>
@@ -1966,7 +1966,7 @@
         <w:rPr>
           <w:sz w:val="20"/>
         </w:rPr>
-        <w:t>onError sem main[1] — Erro descartado silenciosamente. Sempre usar continueErrorOutput + segundo output conectado ao handler.</w:t>
+        <w:t>onError sem main[1]: Erro descartado silenciosamente. Sempre usar continueErrorOutput + segundo output conectado ao handler.</w:t>
       </w:r>
     </w:p>
     <w:p>
@@ -1977,7 +1977,7 @@
         <w:rPr>
           <w:sz w:val="20"/>
         </w:rPr>
-        <w:t>Retentar 4xx — Queima API credits à toa. Erro do cliente (400, 401, 403, 404) não vai mudar na próxima tentativa. Só retentar 5xx / timeout / DNS.</w:t>
+        <w:t>Retentar 4xx: Queima API credits à toa. Erro do cliente (400, 401, 403, 404) não vai mudar na próxima tentativa. Só retentar 5xx / timeout / DNS.</w:t>
       </w:r>
     </w:p>
     <w:p>
@@ -1988,7 +1988,7 @@
         <w:rPr>
           <w:sz w:val="20"/>
         </w:rPr>
-        <w:t>Error workflow no mesmo canal — Se o workflow de erro usa o mesmo Slack que o principal, uma falha no Slack cria recursão infinita. Usar canais separados.</w:t>
+        <w:t>Error workflow no mesmo canal: Se o workflow de erro usa o mesmo Slack que o principal, uma falha no Slack cria recursão infinita. Usar canais separados.</w:t>
       </w:r>
     </w:p>
     <w:p>
@@ -1999,7 +1999,7 @@
         <w:rPr>
           <w:sz w:val="20"/>
         </w:rPr>
-        <w:t>200 no erro — Se a resposta é 200 mas houve falha interna, quem chamou nunca sabe. Propagar status HTTP correto.</w:t>
+        <w:t>200 no erro: Se a resposta é 200 mas houve falha interna, quem chamou nunca sabe. Propagar status HTTP correto.</w:t>
       </w:r>
     </w:p>
     <w:p>
@@ -2010,7 +2010,7 @@
         <w:rPr>
           <w:sz w:val="20"/>
         </w:rPr>
-        <w:t>Não publicar o error handler — Código antigo rodando mesmo depois de "corrigido". Sempre publish (Shift+P) após configurar ou alterar.</w:t>
+        <w:t>Não publicar o error handler: Código antigo rodando mesmo depois de "corrigido". Sempre publish (Shift+P) após configurar ou alterar.</w:t>
       </w:r>
     </w:p>
     <w:p>
@@ -2021,7 +2021,7 @@
         <w:rPr>
           <w:sz w:val="20"/>
         </w:rPr>
-        <w:t>Payload sem correlationId — Sem um ID estável entre retries, não é possível ligar uma falha à sua causa original.</w:t>
+        <w:t>Payload sem correlationId: Sem um ID estável entre retries, não é possível ligar uma falha à sua causa original.</w:t>
       </w:r>
     </w:p>
     <w:p>
@@ -2402,6 +2402,143 @@
         </w:tc>
       </w:tr>
     </w:tbl>
+    <w:p>
+      <w:pPr>
+        <w:pStyle w:val="Heading1"/>
+      </w:pPr>
+      <w:r>
+        <w:rPr>
+          <w:color w:val="8B4513"/>
+        </w:rPr>
+        <w:t>13. Decisoes e tradeoffs</w:t>
+      </w:r>
+    </w:p>
+    <w:p>
+      <w:pPr>
+        <w:pStyle w:val="ListBullet"/>
+      </w:pPr>
+      <w:r>
+        <w:rPr>
+          <w:sz w:val="20"/>
+        </w:rPr>
+        <w:t>Handler central unico: manutencao em um unico ponto com 10 nos validados com n8nac. Se o handler cair, perde-se notificacao temporaria, mas nao o dado, pois a DLQ esta no Supabase e o Monitor roda a cada 5 min.</w:t>
+      </w:r>
+    </w:p>
+    <w:p>
+      <w:pPr>
+        <w:pStyle w:val="ListBullet"/>
+      </w:pPr>
+      <w:r>
+        <w:rPr>
+          <w:sz w:val="20"/>
+        </w:rPr>
+        <w:t>Tres camadas obrigatorias: Camada 1 captura cerca de 73% das falhas transientes sem overhead externo, Camada 2 classifica e notifica em menos de 1 min e Camada 3 impede cascata. Custo de mais configuracao por no em troca de auto-cura acima de 70%.</w:t>
+      </w:r>
+    </w:p>
+    <w:p>
+      <w:pPr>
+        <w:pStyle w:val="ListBullet"/>
+      </w:pPr>
+      <w:r>
+        <w:rPr>
+          <w:sz w:val="20"/>
+        </w:rPr>
+        <w:t>Code node nunca retenta: erro de logica como toDateTime undefined ou null constraint em telefone nao se resolve com retry. Exige validacao com IF e try/catch.</w:t>
+      </w:r>
+    </w:p>
+    <w:p>
+      <w:pPr>
+        <w:pStyle w:val="ListBullet"/>
+      </w:pPr>
+      <w:r>
+        <w:rPr>
+          <w:sz w:val="20"/>
+        </w:rPr>
+        <w:t>Breaker isolado por workflow: limiar de 5 falhas consecutivas e cooldown de 5 min com recovery automatico, em troca de estabilidade sistemica.</w:t>
+      </w:r>
+    </w:p>
+    <w:p>
+      <w:pPr>
+        <w:pStyle w:val="ListBullet"/>
+      </w:pPr>
+      <w:r>
+        <w:rPr>
+          <w:sz w:val="20"/>
+        </w:rPr>
+        <w:t>DLQ permanente no Supabase: schema v2.1 com 4 tabelas e 4 views preserva payload com correlationId estavel para replay, com custo de manter migracao e views como vw_error_health_score.</w:t>
+      </w:r>
+    </w:p>
+    <w:p>
+      <w:pPr>
+        <w:pStyle w:val="Heading1"/>
+      </w:pPr>
+      <w:r>
+        <w:rPr>
+          <w:color w:val="8B4513"/>
+        </w:rPr>
+        <w:t>14. Impacto no negocio</w:t>
+      </w:r>
+    </w:p>
+    <w:p>
+      <w:r>
+        <w:t>Com 7 workflows SDR IA sem notificacao e deteccao levando dias, cada falha silenciosa derrubava o SLA de atendimento a leads sem ninguem saber. O padrao reduz a deteccao para menos de 1 min via Slack, eleva a auto-cura para mais de 70% com retry no no e zera circuitos abertos sem alerta (de 100% para 0%). O retrofit completo cabe em 4 dias, com cerca de 1h para as 5 correcoes pontuais ja mapeadas (20 min no ADPLAN e 10 min em cada um dos outros 4), o que corta risco operacional e retrabalho de investigacao manual.</w:t>
+      </w:r>
+    </w:p>
+    <w:p>
+      <w:pPr>
+        <w:pStyle w:val="Heading1"/>
+      </w:pPr>
+      <w:r>
+        <w:rPr>
+          <w:color w:val="8B4513"/>
+        </w:rPr>
+        <w:t>15. Referencias de estudo</w:t>
+      </w:r>
+    </w:p>
+    <w:p>
+      <w:pPr>
+        <w:pStyle w:val="ListBullet"/>
+      </w:pPr>
+      <w:r>
+        <w:rPr>
+          <w:sz w:val="20"/>
+        </w:rPr>
+        <w:t>Curso: Automacao e Orquestracao n8n do Basico ao Avancado, na Udemy.</w:t>
+      </w:r>
+    </w:p>
+    <w:p>
+      <w:pPr>
+        <w:pStyle w:val="ListBullet"/>
+      </w:pPr>
+      <w:r>
+        <w:rPr>
+          <w:sz w:val="20"/>
+        </w:rPr>
+        <w:t>Video: Error Trigger in n8n, tratamento centralizado de erros, no YouTube, canal oficial n8n.</w:t>
+      </w:r>
+    </w:p>
+    <w:p>
+      <w:pPr>
+        <w:pStyle w:val="ListBullet"/>
+      </w:pPr>
+      <w:r>
+        <w:rPr>
+          <w:sz w:val="20"/>
+        </w:rPr>
+        <w:t>Doc: n8n Docs, Error handling with Error Trigger workflows, na plataforma n8n Docs.</w:t>
+      </w:r>
+    </w:p>
+    <w:p>
+      <w:pPr>
+        <w:pStyle w:val="ListBullet"/>
+      </w:pPr>
+      <w:r>
+        <w:rPr>
+          <w:sz w:val="20"/>
+        </w:rPr>
+        <w:t>Doc: Supabase Docs, Database tables, views and indexes, na plataforma Supabase Docs.</w:t>
+      </w:r>
+    </w:p>
     <w:sectPr>
       <w:pgSz w:w="12240" w:h="15840"/>
       <w:pgMar w:top="1417" w:right="1701" w:bottom="1417" w:left="1701" w:header="720" w:footer="720" w:gutter="0"/>

</xml_diff>

<commit_message>
feat(pages): acentuacao PT-BR completa no PDI (md/html/json/py + DOCX/PDF regenerados)
- restauracao de acentos em 310 md, 78 html e 31 json (apply + 4 seds + dashes)
- 40 gerar-docx.py corrigidos via tokenize (strings/comentarios apenas)
- report.json: chaves area->área, titulos e secoes acentuados
- 40 DOCX e 56 PDFs regenerados; orfao pdi-a1-report.pdf removido
- portal: stat de arquivos 647 -> 646
- validacao: 367 links 0 quebrados, zero travessoes, dry-run auto=4 MAPA=peca/referencia (verbos intencionais)
</commit_message>
<xml_diff>
--- a/_inbox/PDI/01-orquestracao-corporativa-n8n/atividade-1-padrao-erros-sdr/7-apresentacao/pdi-orquestracao-corporativa-n8n-a1.docx
+++ b/_inbox/PDI/01-orquestracao-corporativa-n8n/atividade-1-padrao-erros-sdr/7-apresentacao/pdi-orquestracao-corporativa-n8n-a1.docx
@@ -2410,7 +2410,7 @@
         <w:rPr>
           <w:color w:val="8B4513"/>
         </w:rPr>
-        <w:t>13. Decisoes e tradeoffs</w:t>
+        <w:t>13. Decisões e tradeoffs</w:t>
       </w:r>
     </w:p>
     <w:p>
@@ -2421,7 +2421,7 @@
         <w:rPr>
           <w:sz w:val="20"/>
         </w:rPr>
-        <w:t>Handler central unico: manutencao em um unico ponto com 10 nos validados com n8nac. Se o handler cair, perde-se notificacao temporaria, mas nao o dado, pois a DLQ esta no Supabase e o Monitor roda a cada 5 min.</w:t>
+        <w:t>Handler central único: manutenção em um único ponto com 10 nos validados com n8nac. Se o handler cair, perde-se notificação temporária, mas não o dado, pois a DLQ esta no Supabase e o Monitor roda a cada 5 min.</w:t>
       </w:r>
     </w:p>
     <w:p>
@@ -2432,7 +2432,7 @@
         <w:rPr>
           <w:sz w:val="20"/>
         </w:rPr>
-        <w:t>Tres camadas obrigatorias: Camada 1 captura cerca de 73% das falhas transientes sem overhead externo, Camada 2 classifica e notifica em menos de 1 min e Camada 3 impede cascata. Custo de mais configuracao por no em troca de auto-cura acima de 70%.</w:t>
+        <w:t>Três camadas obrigatórias: Camada 1 captura cerca de 73% das falhas transientes sem overhead externo, Camada 2 classifica e notifica em menos de 1 min e Camada 3 impede cascata. Custo de mais configuração por no em troca de auto-cura acima de 70%.</w:t>
       </w:r>
     </w:p>
     <w:p>
@@ -2443,7 +2443,7 @@
         <w:rPr>
           <w:sz w:val="20"/>
         </w:rPr>
-        <w:t>Code node nunca retenta: erro de logica como toDateTime undefined ou null constraint em telefone nao se resolve com retry. Exige validacao com IF e try/catch.</w:t>
+        <w:t>Code node nunca retenta: erro de lógica como toDateTime undefined ou null constraint em telefone não se resolve com retry. Exige validação com IF e try/catch.</w:t>
       </w:r>
     </w:p>
     <w:p>
@@ -2454,7 +2454,7 @@
         <w:rPr>
           <w:sz w:val="20"/>
         </w:rPr>
-        <w:t>Breaker isolado por workflow: limiar de 5 falhas consecutivas e cooldown de 5 min com recovery automatico, em troca de estabilidade sistemica.</w:t>
+        <w:t>Breaker isolado por workflow: limiar de 5 falhas consecutivas e cooldown de 5 min com recovery automático, em troca de estabilidade sistêmica.</w:t>
       </w:r>
     </w:p>
     <w:p>
@@ -2465,7 +2465,7 @@
         <w:rPr>
           <w:sz w:val="20"/>
         </w:rPr>
-        <w:t>DLQ permanente no Supabase: schema v2.1 com 4 tabelas e 4 views preserva payload com correlationId estavel para replay, com custo de manter migracao e views como vw_error_health_score.</w:t>
+        <w:t>DLQ permanente no Supabase: schema v2.1 com 4 tabelas e 4 views preserva payload com correlationId estável para replay, com custo de manter migração e views como vw_error_health_score.</w:t>
       </w:r>
     </w:p>
     <w:p>
@@ -2476,12 +2476,12 @@
         <w:rPr>
           <w:color w:val="8B4513"/>
         </w:rPr>
-        <w:t>14. Impacto no negocio</w:t>
+        <w:t>14. Impacto no negócio</w:t>
       </w:r>
     </w:p>
     <w:p>
       <w:r>
-        <w:t>Com 7 workflows SDR IA sem notificacao e deteccao levando dias, cada falha silenciosa derrubava o SLA de atendimento a leads sem ninguem saber. O padrao reduz a deteccao para menos de 1 min via Slack, eleva a auto-cura para mais de 70% com retry no no e zera circuitos abertos sem alerta (de 100% para 0%). O retrofit completo cabe em 4 dias, com cerca de 1h para as 5 correcoes pontuais ja mapeadas (20 min no ADPLAN e 10 min em cada um dos outros 4), o que corta risco operacional e retrabalho de investigacao manual.</w:t>
+        <w:t>Com 7 workflows SDR IA sem notificação e detecção levando dias, cada falha silenciosa derrubava o SLA de atendimento a leads sem ninguém saber. O padrão reduz a detecção para menos de 1 min via Slack, eleva a auto-cura para mais de 70% com retry no no e zera circuitos abertos sem alerta (de 100% para 0%). O retrofit completo cabe em 4 dias, com cerca de 1h para as 5 correções pontuais já mapeadas (20 min no ADPLAN e 10 min em cada um dos outros 4), o que corta risco operacional e retrabalho de investigação manual.</w:t>
       </w:r>
     </w:p>
     <w:p>
@@ -2492,7 +2492,7 @@
         <w:rPr>
           <w:color w:val="8B4513"/>
         </w:rPr>
-        <w:t>15. Referencias de estudo</w:t>
+        <w:t>15. Referências de estudo</w:t>
       </w:r>
     </w:p>
     <w:p>
@@ -2503,7 +2503,7 @@
         <w:rPr>
           <w:sz w:val="20"/>
         </w:rPr>
-        <w:t>Curso: Automacao e Orquestracao n8n do Basico ao Avancado, na Udemy.</w:t>
+        <w:t>Curso: Automação e Orquestração n8n do Básico ao Avançado, na Udemy.</w:t>
       </w:r>
     </w:p>
     <w:p>
@@ -2514,7 +2514,7 @@
         <w:rPr>
           <w:sz w:val="20"/>
         </w:rPr>
-        <w:t>Video: Error Trigger in n8n, tratamento centralizado de erros, no YouTube, canal oficial n8n.</w:t>
+        <w:t>Vídeo: Error Trigger in n8n, tratamento centralizado de erros, no YouTube, canal oficial n8n.</w:t>
       </w:r>
     </w:p>
     <w:p>

</xml_diff>